<commit_message>
docs: update project timeline
</commit_message>
<xml_diff>
--- a/docs/PROJECT_TIMELINE.docx
+++ b/docs/PROJECT_TIMELINE.docx
@@ -407,7 +407,7 @@
                 <w:szCs w:val="24"/>
                 <w:lang w:val="en-US" w:eastAsia="zh-CN" w:bidi="ar"/>
               </w:rPr>
-              <w:t>Đang thực hiện</w:t>
+              <w:t>Đang thực hiện (Ngày 1–7 hoàn thành)</w:t>
             </w:r>
           </w:p>
         </w:tc>
@@ -1422,7 +1422,842 @@
                 <w:szCs w:val="24"/>
                 <w:lang w:val="en-US" w:eastAsia="zh-CN" w:bidi="ar"/>
               </w:rPr>
-              <w:t>Đang thực hiện</w:t>
+              <w:t>Hoàn thành</w:t>
+            </w:r>
+          </w:p>
+        </w:tc>
+      </w:tr>
+      <w:tr>
+        <w:tblPrEx>
+          <w:tblBorders>
+            <w:top w:val="none" w:color="auto" w:sz="0" w:space="0"/>
+            <w:left w:val="none" w:color="auto" w:sz="0" w:space="0"/>
+            <w:bottom w:val="none" w:color="auto" w:sz="0" w:space="0"/>
+            <w:right w:val="none" w:color="auto" w:sz="0" w:space="0"/>
+            <w:insideH w:val="none" w:color="auto" w:sz="0" w:space="0"/>
+            <w:insideV w:val="none" w:color="auto" w:sz="0" w:space="0"/>
+          </w:tblBorders>
+          <w:shd w:val="clear"/>
+          <w:tblCellMar>
+            <w:top w:w="15" w:type="dxa"/>
+            <w:left w:w="15" w:type="dxa"/>
+            <w:bottom w:w="15" w:type="dxa"/>
+            <w:right w:w="15" w:type="dxa"/>
+          </w:tblCellMar>
+        </w:tblPrEx>
+        <w:trPr>
+          <w:tblCellSpacing w:w="15" w:type="dxa"/>
+        </w:trPr>
+        <w:tc>
+          <w:tcPr>
+            <w:tcW w:w="730" w:type="dxa"/>
+            <w:shd w:val="clear"/>
+            <w:vAlign w:val="center"/>
+          </w:tcPr>
+          <w:p>
+            <w:pPr>
+              <w:keepNext w:val="0"/>
+              <w:keepLines w:val="0"/>
+              <w:widowControl/>
+              <w:suppressLineNumbers w:val="0"/>
+              <w:jc w:val="left"/>
+              <w:rPr>
+                <w:rFonts w:hint="default" w:ascii="Times New Roman" w:hAnsi="Times New Roman" w:cs="Times New Roman"/>
+              </w:rPr>
+            </w:pPr>
+            <w:r>
+              <w:rPr>
+                <w:rFonts w:hint="default" w:ascii="Times New Roman" w:hAnsi="Times New Roman" w:eastAsia="宋体" w:cs="Times New Roman"/>
+                <w:kern w:val="0"/>
+                <w:sz w:val="24"/>
+                <w:szCs w:val="24"/>
+                <w:lang w:val="en-US" w:eastAsia="zh-CN" w:bidi="ar"/>
+              </w:rPr>
+              <w:t>Ngày 3</w:t>
+            </w:r>
+          </w:p>
+        </w:tc>
+        <w:tc>
+          <w:tcPr>
+            <w:tcW w:w="1159" w:type="dxa"/>
+            <w:shd w:val="clear"/>
+            <w:vAlign w:val="center"/>
+          </w:tcPr>
+          <w:p>
+            <w:pPr>
+              <w:keepNext w:val="0"/>
+              <w:keepLines w:val="0"/>
+              <w:widowControl/>
+              <w:suppressLineNumbers w:val="0"/>
+              <w:jc w:val="left"/>
+              <w:rPr>
+                <w:rFonts w:hint="default" w:ascii="Times New Roman" w:hAnsi="Times New Roman" w:cs="Times New Roman"/>
+              </w:rPr>
+            </w:pPr>
+            <w:r>
+              <w:rPr>
+                <w:rFonts w:hint="default" w:ascii="Times New Roman" w:hAnsi="Times New Roman" w:eastAsia="宋体" w:cs="Times New Roman"/>
+                <w:kern w:val="0"/>
+                <w:sz w:val="24"/>
+                <w:szCs w:val="24"/>
+                <w:lang w:val="en-US" w:eastAsia="zh-CN" w:bidi="ar"/>
+              </w:rPr>
+              <w:t>06/06/2026</w:t>
+            </w:r>
+          </w:p>
+        </w:tc>
+        <w:tc>
+          <w:tcPr>
+            <w:tcW w:w="2347" w:type="dxa"/>
+            <w:shd w:val="clear"/>
+            <w:vAlign w:val="center"/>
+          </w:tcPr>
+          <w:p>
+            <w:pPr>
+              <w:keepNext w:val="0"/>
+              <w:keepLines w:val="0"/>
+              <w:widowControl/>
+              <w:suppressLineNumbers w:val="0"/>
+              <w:jc w:val="left"/>
+              <w:rPr>
+                <w:rFonts w:hint="default" w:ascii="Times New Roman" w:hAnsi="Times New Roman" w:cs="Times New Roman"/>
+              </w:rPr>
+            </w:pPr>
+            <w:r>
+              <w:rPr>
+                <w:rFonts w:hint="default" w:ascii="Times New Roman" w:hAnsi="Times New Roman" w:eastAsia="宋体" w:cs="Times New Roman"/>
+                <w:kern w:val="0"/>
+                <w:sz w:val="24"/>
+                <w:szCs w:val="24"/>
+                <w:lang w:val="en-US" w:eastAsia="zh-CN" w:bidi="ar"/>
+              </w:rPr>
+              <w:t>ERD nhóm lịch hẹn + hàng chờ</w:t>
+            </w:r>
+          </w:p>
+        </w:tc>
+        <w:tc>
+          <w:tcPr>
+            <w:tcW w:w="2910" w:type="dxa"/>
+            <w:shd w:val="clear"/>
+            <w:vAlign w:val="center"/>
+          </w:tcPr>
+          <w:p>
+            <w:pPr>
+              <w:keepNext w:val="0"/>
+              <w:keepLines w:val="0"/>
+              <w:widowControl/>
+              <w:suppressLineNumbers w:val="0"/>
+              <w:jc w:val="left"/>
+              <w:rPr>
+                <w:rFonts w:hint="default" w:ascii="Times New Roman" w:hAnsi="Times New Roman" w:cs="Times New Roman"/>
+              </w:rPr>
+            </w:pPr>
+            <w:r>
+              <w:rPr>
+                <w:rFonts w:hint="default" w:ascii="Times New Roman" w:hAnsi="Times New Roman" w:eastAsia="宋体" w:cs="Times New Roman"/>
+                <w:kern w:val="0"/>
+                <w:sz w:val="24"/>
+                <w:szCs w:val="24"/>
+                <w:lang w:val="en-US" w:eastAsia="zh-CN" w:bidi="ar"/>
+              </w:rPr>
+              <w:t>ERD partial: nhóm lịch hẹn</w:t>
+            </w:r>
+          </w:p>
+        </w:tc>
+        <w:tc>
+          <w:tcPr>
+            <w:tcW w:w="915" w:type="dxa"/>
+            <w:shd w:val="clear"/>
+            <w:vAlign w:val="center"/>
+          </w:tcPr>
+          <w:p>
+            <w:pPr>
+              <w:keepNext w:val="0"/>
+              <w:keepLines w:val="0"/>
+              <w:widowControl/>
+              <w:suppressLineNumbers w:val="0"/>
+              <w:jc w:val="left"/>
+              <w:rPr>
+                <w:rFonts w:hint="default" w:ascii="Times New Roman" w:hAnsi="Times New Roman" w:cs="Times New Roman"/>
+              </w:rPr>
+            </w:pPr>
+            <w:r>
+              <w:rPr>
+                <w:rFonts w:hint="default" w:ascii="Times New Roman" w:hAnsi="Times New Roman" w:eastAsia="宋体" w:cs="Times New Roman"/>
+                <w:kern w:val="0"/>
+                <w:sz w:val="24"/>
+                <w:szCs w:val="24"/>
+                <w:lang w:val="en-US" w:eastAsia="zh-CN" w:bidi="ar"/>
+              </w:rPr>
+              <w:t>Hoàn thành</w:t>
+            </w:r>
+          </w:p>
+        </w:tc>
+      </w:tr>
+      <w:tr>
+        <w:tblPrEx>
+          <w:tblBorders>
+            <w:top w:val="none" w:color="auto" w:sz="0" w:space="0"/>
+            <w:left w:val="none" w:color="auto" w:sz="0" w:space="0"/>
+            <w:bottom w:val="none" w:color="auto" w:sz="0" w:space="0"/>
+            <w:right w:val="none" w:color="auto" w:sz="0" w:space="0"/>
+            <w:insideH w:val="none" w:color="auto" w:sz="0" w:space="0"/>
+            <w:insideV w:val="none" w:color="auto" w:sz="0" w:space="0"/>
+          </w:tblBorders>
+          <w:shd w:val="clear"/>
+          <w:tblCellMar>
+            <w:top w:w="15" w:type="dxa"/>
+            <w:left w:w="15" w:type="dxa"/>
+            <w:bottom w:w="15" w:type="dxa"/>
+            <w:right w:w="15" w:type="dxa"/>
+          </w:tblCellMar>
+        </w:tblPrEx>
+        <w:trPr>
+          <w:tblCellSpacing w:w="15" w:type="dxa"/>
+        </w:trPr>
+        <w:tc>
+          <w:tcPr>
+            <w:tcW w:w="730" w:type="dxa"/>
+            <w:shd w:val="clear"/>
+            <w:vAlign w:val="center"/>
+          </w:tcPr>
+          <w:p>
+            <w:pPr>
+              <w:keepNext w:val="0"/>
+              <w:keepLines w:val="0"/>
+              <w:widowControl/>
+              <w:suppressLineNumbers w:val="0"/>
+              <w:jc w:val="left"/>
+              <w:rPr>
+                <w:rFonts w:hint="default" w:ascii="Times New Roman" w:hAnsi="Times New Roman" w:cs="Times New Roman"/>
+              </w:rPr>
+            </w:pPr>
+            <w:r>
+              <w:rPr>
+                <w:rFonts w:hint="default" w:ascii="Times New Roman" w:hAnsi="Times New Roman" w:eastAsia="宋体" w:cs="Times New Roman"/>
+                <w:kern w:val="0"/>
+                <w:sz w:val="24"/>
+                <w:szCs w:val="24"/>
+                <w:lang w:val="en-US" w:eastAsia="zh-CN" w:bidi="ar"/>
+              </w:rPr>
+              <w:t>Ngày 4</w:t>
+            </w:r>
+          </w:p>
+        </w:tc>
+        <w:tc>
+          <w:tcPr>
+            <w:tcW w:w="1159" w:type="dxa"/>
+            <w:shd w:val="clear"/>
+            <w:vAlign w:val="center"/>
+          </w:tcPr>
+          <w:p>
+            <w:pPr>
+              <w:keepNext w:val="0"/>
+              <w:keepLines w:val="0"/>
+              <w:widowControl/>
+              <w:suppressLineNumbers w:val="0"/>
+              <w:jc w:val="left"/>
+              <w:rPr>
+                <w:rFonts w:hint="default" w:ascii="Times New Roman" w:hAnsi="Times New Roman" w:cs="Times New Roman"/>
+              </w:rPr>
+            </w:pPr>
+            <w:r>
+              <w:rPr>
+                <w:rFonts w:hint="default" w:ascii="Times New Roman" w:hAnsi="Times New Roman" w:eastAsia="宋体" w:cs="Times New Roman"/>
+                <w:kern w:val="0"/>
+                <w:sz w:val="24"/>
+                <w:szCs w:val="24"/>
+                <w:lang w:val="en-US" w:eastAsia="zh-CN" w:bidi="ar"/>
+              </w:rPr>
+              <w:t>07/06/2026</w:t>
+            </w:r>
+          </w:p>
+        </w:tc>
+        <w:tc>
+          <w:tcPr>
+            <w:tcW w:w="2347" w:type="dxa"/>
+            <w:shd w:val="clear"/>
+            <w:vAlign w:val="center"/>
+          </w:tcPr>
+          <w:p>
+            <w:pPr>
+              <w:keepNext w:val="0"/>
+              <w:keepLines w:val="0"/>
+              <w:widowControl/>
+              <w:suppressLineNumbers w:val="0"/>
+              <w:jc w:val="left"/>
+              <w:rPr>
+                <w:rFonts w:hint="default" w:ascii="Times New Roman" w:hAnsi="Times New Roman" w:cs="Times New Roman"/>
+              </w:rPr>
+            </w:pPr>
+            <w:r>
+              <w:rPr>
+                <w:rFonts w:hint="default" w:ascii="Times New Roman" w:hAnsi="Times New Roman" w:eastAsia="宋体" w:cs="Times New Roman"/>
+                <w:kern w:val="0"/>
+                <w:sz w:val="24"/>
+                <w:szCs w:val="24"/>
+                <w:lang w:val="en-US" w:eastAsia="zh-CN" w:bidi="ar"/>
+              </w:rPr>
+              <w:t>ERD nhóm CLS</w:t>
+            </w:r>
+          </w:p>
+        </w:tc>
+        <w:tc>
+          <w:tcPr>
+            <w:tcW w:w="2910" w:type="dxa"/>
+            <w:shd w:val="clear"/>
+            <w:vAlign w:val="center"/>
+          </w:tcPr>
+          <w:p>
+            <w:pPr>
+              <w:keepNext w:val="0"/>
+              <w:keepLines w:val="0"/>
+              <w:widowControl/>
+              <w:suppressLineNumbers w:val="0"/>
+              <w:jc w:val="left"/>
+              <w:rPr>
+                <w:rFonts w:hint="default" w:ascii="Times New Roman" w:hAnsi="Times New Roman" w:cs="Times New Roman"/>
+              </w:rPr>
+            </w:pPr>
+            <w:r>
+              <w:rPr>
+                <w:rFonts w:hint="default" w:ascii="Times New Roman" w:hAnsi="Times New Roman" w:eastAsia="宋体" w:cs="Times New Roman"/>
+                <w:kern w:val="0"/>
+                <w:sz w:val="24"/>
+                <w:szCs w:val="24"/>
+                <w:lang w:val="en-US" w:eastAsia="zh-CN" w:bidi="ar"/>
+              </w:rPr>
+              <w:t>ERD partial: nhóm CLS</w:t>
+            </w:r>
+          </w:p>
+        </w:tc>
+        <w:tc>
+          <w:tcPr>
+            <w:tcW w:w="915" w:type="dxa"/>
+            <w:shd w:val="clear"/>
+            <w:vAlign w:val="center"/>
+          </w:tcPr>
+          <w:p>
+            <w:pPr>
+              <w:keepNext w:val="0"/>
+              <w:keepLines w:val="0"/>
+              <w:widowControl/>
+              <w:suppressLineNumbers w:val="0"/>
+              <w:jc w:val="left"/>
+              <w:rPr>
+                <w:rFonts w:hint="default" w:ascii="Times New Roman" w:hAnsi="Times New Roman" w:cs="Times New Roman"/>
+              </w:rPr>
+            </w:pPr>
+            <w:r>
+              <w:rPr>
+                <w:rFonts w:hint="default" w:ascii="Times New Roman" w:hAnsi="Times New Roman" w:eastAsia="宋体" w:cs="Times New Roman"/>
+                <w:kern w:val="0"/>
+                <w:sz w:val="24"/>
+                <w:szCs w:val="24"/>
+                <w:lang w:val="en-US" w:eastAsia="zh-CN" w:bidi="ar"/>
+              </w:rPr>
+              <w:t>Hoàn thành</w:t>
+            </w:r>
+          </w:p>
+        </w:tc>
+      </w:tr>
+      <w:tr>
+        <w:tblPrEx>
+          <w:tblBorders>
+            <w:top w:val="none" w:color="auto" w:sz="0" w:space="0"/>
+            <w:left w:val="none" w:color="auto" w:sz="0" w:space="0"/>
+            <w:bottom w:val="none" w:color="auto" w:sz="0" w:space="0"/>
+            <w:right w:val="none" w:color="auto" w:sz="0" w:space="0"/>
+            <w:insideH w:val="none" w:color="auto" w:sz="0" w:space="0"/>
+            <w:insideV w:val="none" w:color="auto" w:sz="0" w:space="0"/>
+          </w:tblBorders>
+          <w:shd w:val="clear"/>
+          <w:tblCellMar>
+            <w:top w:w="15" w:type="dxa"/>
+            <w:left w:w="15" w:type="dxa"/>
+            <w:bottom w:w="15" w:type="dxa"/>
+            <w:right w:w="15" w:type="dxa"/>
+          </w:tblCellMar>
+        </w:tblPrEx>
+        <w:trPr>
+          <w:tblCellSpacing w:w="15" w:type="dxa"/>
+        </w:trPr>
+        <w:tc>
+          <w:tcPr>
+            <w:tcW w:w="730" w:type="dxa"/>
+            <w:shd w:val="clear"/>
+            <w:vAlign w:val="center"/>
+          </w:tcPr>
+          <w:p>
+            <w:pPr>
+              <w:keepNext w:val="0"/>
+              <w:keepLines w:val="0"/>
+              <w:widowControl/>
+              <w:suppressLineNumbers w:val="0"/>
+              <w:jc w:val="left"/>
+              <w:rPr>
+                <w:rFonts w:hint="default" w:ascii="Times New Roman" w:hAnsi="Times New Roman" w:cs="Times New Roman"/>
+              </w:rPr>
+            </w:pPr>
+            <w:r>
+              <w:rPr>
+                <w:rFonts w:hint="default" w:ascii="Times New Roman" w:hAnsi="Times New Roman" w:eastAsia="宋体" w:cs="Times New Roman"/>
+                <w:kern w:val="0"/>
+                <w:sz w:val="24"/>
+                <w:szCs w:val="24"/>
+                <w:lang w:val="en-US" w:eastAsia="zh-CN" w:bidi="ar"/>
+              </w:rPr>
+              <w:t>Ngày 5</w:t>
+            </w:r>
+          </w:p>
+        </w:tc>
+        <w:tc>
+          <w:tcPr>
+            <w:tcW w:w="1159" w:type="dxa"/>
+            <w:shd w:val="clear"/>
+            <w:vAlign w:val="center"/>
+          </w:tcPr>
+          <w:p>
+            <w:pPr>
+              <w:keepNext w:val="0"/>
+              <w:keepLines w:val="0"/>
+              <w:widowControl/>
+              <w:suppressLineNumbers w:val="0"/>
+              <w:jc w:val="left"/>
+              <w:rPr>
+                <w:rFonts w:hint="default" w:ascii="Times New Roman" w:hAnsi="Times New Roman" w:cs="Times New Roman"/>
+              </w:rPr>
+            </w:pPr>
+            <w:r>
+              <w:rPr>
+                <w:rFonts w:hint="default" w:ascii="Times New Roman" w:hAnsi="Times New Roman" w:eastAsia="宋体" w:cs="Times New Roman"/>
+                <w:kern w:val="0"/>
+                <w:sz w:val="24"/>
+                <w:szCs w:val="24"/>
+                <w:lang w:val="en-US" w:eastAsia="zh-CN" w:bidi="ar"/>
+              </w:rPr>
+              <w:t>08/06/2026</w:t>
+            </w:r>
+          </w:p>
+        </w:tc>
+        <w:tc>
+          <w:tcPr>
+            <w:tcW w:w="2347" w:type="dxa"/>
+            <w:shd w:val="clear"/>
+            <w:vAlign w:val="center"/>
+          </w:tcPr>
+          <w:p>
+            <w:pPr>
+              <w:keepNext w:val="0"/>
+              <w:keepLines w:val="0"/>
+              <w:widowControl/>
+              <w:suppressLineNumbers w:val="0"/>
+              <w:jc w:val="left"/>
+              <w:rPr>
+                <w:rFonts w:hint="default" w:ascii="Times New Roman" w:hAnsi="Times New Roman" w:cs="Times New Roman"/>
+              </w:rPr>
+            </w:pPr>
+            <w:r>
+              <w:rPr>
+                <w:rFonts w:hint="default" w:ascii="Times New Roman" w:hAnsi="Times New Roman" w:eastAsia="宋体" w:cs="Times New Roman"/>
+                <w:kern w:val="0"/>
+                <w:sz w:val="24"/>
+                <w:szCs w:val="24"/>
+                <w:lang w:val="en-US" w:eastAsia="zh-CN" w:bidi="ar"/>
+              </w:rPr>
+              <w:t>ERD nhóm thuốc + kê đơn</w:t>
+            </w:r>
+          </w:p>
+        </w:tc>
+        <w:tc>
+          <w:tcPr>
+            <w:tcW w:w="2910" w:type="dxa"/>
+            <w:shd w:val="clear"/>
+            <w:vAlign w:val="center"/>
+          </w:tcPr>
+          <w:p>
+            <w:pPr>
+              <w:keepNext w:val="0"/>
+              <w:keepLines w:val="0"/>
+              <w:widowControl/>
+              <w:suppressLineNumbers w:val="0"/>
+              <w:jc w:val="left"/>
+              <w:rPr>
+                <w:rFonts w:hint="default" w:ascii="Times New Roman" w:hAnsi="Times New Roman" w:cs="Times New Roman"/>
+              </w:rPr>
+            </w:pPr>
+            <w:r>
+              <w:rPr>
+                <w:rFonts w:hint="default" w:ascii="Times New Roman" w:hAnsi="Times New Roman" w:eastAsia="宋体" w:cs="Times New Roman"/>
+                <w:kern w:val="0"/>
+                <w:sz w:val="24"/>
+                <w:szCs w:val="24"/>
+                <w:lang w:val="en-US" w:eastAsia="zh-CN" w:bidi="ar"/>
+              </w:rPr>
+              <w:t>ERD partial: nhóm thuốc</w:t>
+            </w:r>
+          </w:p>
+        </w:tc>
+        <w:tc>
+          <w:tcPr>
+            <w:tcW w:w="915" w:type="dxa"/>
+            <w:shd w:val="clear"/>
+            <w:vAlign w:val="center"/>
+          </w:tcPr>
+          <w:p>
+            <w:pPr>
+              <w:keepNext w:val="0"/>
+              <w:keepLines w:val="0"/>
+              <w:widowControl/>
+              <w:suppressLineNumbers w:val="0"/>
+              <w:jc w:val="left"/>
+              <w:rPr>
+                <w:rFonts w:hint="default" w:ascii="Times New Roman" w:hAnsi="Times New Roman" w:cs="Times New Roman"/>
+              </w:rPr>
+            </w:pPr>
+            <w:r>
+              <w:rPr>
+                <w:rFonts w:hint="default" w:ascii="Times New Roman" w:hAnsi="Times New Roman" w:eastAsia="宋体" w:cs="Times New Roman"/>
+                <w:kern w:val="0"/>
+                <w:sz w:val="24"/>
+                <w:szCs w:val="24"/>
+                <w:lang w:val="en-US" w:eastAsia="zh-CN" w:bidi="ar"/>
+              </w:rPr>
+              <w:t>Hoàn thành</w:t>
+            </w:r>
+          </w:p>
+        </w:tc>
+      </w:tr>
+      <w:tr>
+        <w:tblPrEx>
+          <w:tblBorders>
+            <w:top w:val="none" w:color="auto" w:sz="0" w:space="0"/>
+            <w:left w:val="none" w:color="auto" w:sz="0" w:space="0"/>
+            <w:bottom w:val="none" w:color="auto" w:sz="0" w:space="0"/>
+            <w:right w:val="none" w:color="auto" w:sz="0" w:space="0"/>
+            <w:insideH w:val="none" w:color="auto" w:sz="0" w:space="0"/>
+            <w:insideV w:val="none" w:color="auto" w:sz="0" w:space="0"/>
+          </w:tblBorders>
+          <w:shd w:val="clear"/>
+          <w:tblCellMar>
+            <w:top w:w="15" w:type="dxa"/>
+            <w:left w:w="15" w:type="dxa"/>
+            <w:bottom w:w="15" w:type="dxa"/>
+            <w:right w:w="15" w:type="dxa"/>
+          </w:tblCellMar>
+        </w:tblPrEx>
+        <w:trPr>
+          <w:tblCellSpacing w:w="15" w:type="dxa"/>
+        </w:trPr>
+        <w:tc>
+          <w:tcPr>
+            <w:tcW w:w="730" w:type="dxa"/>
+            <w:shd w:val="clear"/>
+            <w:vAlign w:val="center"/>
+          </w:tcPr>
+          <w:p>
+            <w:pPr>
+              <w:keepNext w:val="0"/>
+              <w:keepLines w:val="0"/>
+              <w:widowControl/>
+              <w:suppressLineNumbers w:val="0"/>
+              <w:jc w:val="left"/>
+              <w:rPr>
+                <w:rFonts w:hint="default" w:ascii="Times New Roman" w:hAnsi="Times New Roman" w:cs="Times New Roman"/>
+              </w:rPr>
+            </w:pPr>
+            <w:r>
+              <w:rPr>
+                <w:rFonts w:hint="default" w:ascii="Times New Roman" w:hAnsi="Times New Roman" w:eastAsia="宋体" w:cs="Times New Roman"/>
+                <w:kern w:val="0"/>
+                <w:sz w:val="24"/>
+                <w:szCs w:val="24"/>
+                <w:lang w:val="en-US" w:eastAsia="zh-CN" w:bidi="ar"/>
+              </w:rPr>
+              <w:t>Ngày 6</w:t>
+            </w:r>
+          </w:p>
+        </w:tc>
+        <w:tc>
+          <w:tcPr>
+            <w:tcW w:w="1159" w:type="dxa"/>
+            <w:shd w:val="clear"/>
+            <w:vAlign w:val="center"/>
+          </w:tcPr>
+          <w:p>
+            <w:pPr>
+              <w:keepNext w:val="0"/>
+              <w:keepLines w:val="0"/>
+              <w:widowControl/>
+              <w:suppressLineNumbers w:val="0"/>
+              <w:jc w:val="left"/>
+              <w:rPr>
+                <w:rFonts w:hint="default" w:ascii="Times New Roman" w:hAnsi="Times New Roman" w:cs="Times New Roman"/>
+              </w:rPr>
+            </w:pPr>
+            <w:r>
+              <w:rPr>
+                <w:rFonts w:hint="default" w:ascii="Times New Roman" w:hAnsi="Times New Roman" w:eastAsia="宋体" w:cs="Times New Roman"/>
+                <w:kern w:val="0"/>
+                <w:sz w:val="24"/>
+                <w:szCs w:val="24"/>
+                <w:lang w:val="en-US" w:eastAsia="zh-CN" w:bidi="ar"/>
+              </w:rPr>
+              <w:t>09/06/2026</w:t>
+            </w:r>
+          </w:p>
+        </w:tc>
+        <w:tc>
+          <w:tcPr>
+            <w:tcW w:w="2347" w:type="dxa"/>
+            <w:shd w:val="clear"/>
+            <w:vAlign w:val="center"/>
+          </w:tcPr>
+          <w:p>
+            <w:pPr>
+              <w:keepNext w:val="0"/>
+              <w:keepLines w:val="0"/>
+              <w:widowControl/>
+              <w:suppressLineNumbers w:val="0"/>
+              <w:jc w:val="left"/>
+              <w:rPr>
+                <w:rFonts w:hint="default" w:ascii="Times New Roman" w:hAnsi="Times New Roman" w:cs="Times New Roman"/>
+              </w:rPr>
+            </w:pPr>
+            <w:r>
+              <w:rPr>
+                <w:rFonts w:hint="default" w:ascii="Times New Roman" w:hAnsi="Times New Roman" w:eastAsia="宋体" w:cs="Times New Roman"/>
+                <w:kern w:val="0"/>
+                <w:sz w:val="24"/>
+                <w:szCs w:val="24"/>
+                <w:lang w:val="en-US" w:eastAsia="zh-CN" w:bidi="ar"/>
+              </w:rPr>
+              <w:t>ERD nhóm thanh toán + users</w:t>
+            </w:r>
+          </w:p>
+        </w:tc>
+        <w:tc>
+          <w:tcPr>
+            <w:tcW w:w="2910" w:type="dxa"/>
+            <w:shd w:val="clear"/>
+            <w:vAlign w:val="center"/>
+          </w:tcPr>
+          <w:p>
+            <w:pPr>
+              <w:keepNext w:val="0"/>
+              <w:keepLines w:val="0"/>
+              <w:widowControl/>
+              <w:suppressLineNumbers w:val="0"/>
+              <w:jc w:val="left"/>
+              <w:rPr>
+                <w:rFonts w:hint="default" w:ascii="Times New Roman" w:hAnsi="Times New Roman" w:cs="Times New Roman"/>
+              </w:rPr>
+            </w:pPr>
+            <w:r>
+              <w:rPr>
+                <w:rFonts w:hint="default" w:ascii="Times New Roman" w:hAnsi="Times New Roman" w:eastAsia="宋体" w:cs="Times New Roman"/>
+                <w:kern w:val="0"/>
+                <w:sz w:val="24"/>
+                <w:szCs w:val="24"/>
+                <w:lang w:val="en-US" w:eastAsia="zh-CN" w:bidi="ar"/>
+              </w:rPr>
+              <w:t>ERD partial: thanh toán + users</w:t>
+            </w:r>
+          </w:p>
+        </w:tc>
+        <w:tc>
+          <w:tcPr>
+            <w:tcW w:w="915" w:type="dxa"/>
+            <w:shd w:val="clear"/>
+            <w:vAlign w:val="center"/>
+          </w:tcPr>
+          <w:p>
+            <w:pPr>
+              <w:keepNext w:val="0"/>
+              <w:keepLines w:val="0"/>
+              <w:widowControl/>
+              <w:suppressLineNumbers w:val="0"/>
+              <w:jc w:val="left"/>
+              <w:rPr>
+                <w:rFonts w:hint="default" w:ascii="Times New Roman" w:hAnsi="Times New Roman" w:cs="Times New Roman"/>
+              </w:rPr>
+            </w:pPr>
+            <w:r>
+              <w:rPr>
+                <w:rFonts w:hint="default" w:ascii="Times New Roman" w:hAnsi="Times New Roman" w:eastAsia="宋体" w:cs="Times New Roman"/>
+                <w:kern w:val="0"/>
+                <w:sz w:val="24"/>
+                <w:szCs w:val="24"/>
+                <w:lang w:val="en-US" w:eastAsia="zh-CN" w:bidi="ar"/>
+              </w:rPr>
+              <w:t>Hoàn thành</w:t>
+            </w:r>
+          </w:p>
+        </w:tc>
+      </w:tr>
+      <w:tr>
+        <w:tblPrEx>
+          <w:tblBorders>
+            <w:top w:val="none" w:color="auto" w:sz="0" w:space="0"/>
+            <w:left w:val="none" w:color="auto" w:sz="0" w:space="0"/>
+            <w:bottom w:val="none" w:color="auto" w:sz="0" w:space="0"/>
+            <w:right w:val="none" w:color="auto" w:sz="0" w:space="0"/>
+            <w:insideH w:val="none" w:color="auto" w:sz="0" w:space="0"/>
+            <w:insideV w:val="none" w:color="auto" w:sz="0" w:space="0"/>
+          </w:tblBorders>
+          <w:shd w:val="clear"/>
+          <w:tblCellMar>
+            <w:top w:w="15" w:type="dxa"/>
+            <w:left w:w="15" w:type="dxa"/>
+            <w:bottom w:w="15" w:type="dxa"/>
+            <w:right w:w="15" w:type="dxa"/>
+          </w:tblCellMar>
+        </w:tblPrEx>
+        <w:trPr>
+          <w:tblCellSpacing w:w="15" w:type="dxa"/>
+        </w:trPr>
+        <w:tc>
+          <w:tcPr>
+            <w:tcW w:w="730" w:type="dxa"/>
+            <w:shd w:val="clear"/>
+            <w:vAlign w:val="center"/>
+          </w:tcPr>
+          <w:p>
+            <w:pPr>
+              <w:keepNext w:val="0"/>
+              <w:keepLines w:val="0"/>
+              <w:widowControl/>
+              <w:suppressLineNumbers w:val="0"/>
+              <w:jc w:val="left"/>
+              <w:rPr>
+                <w:rFonts w:hint="default" w:ascii="Times New Roman" w:hAnsi="Times New Roman" w:cs="Times New Roman"/>
+              </w:rPr>
+            </w:pPr>
+            <w:r>
+              <w:rPr>
+                <w:rFonts w:hint="default" w:ascii="Times New Roman" w:hAnsi="Times New Roman" w:eastAsia="宋体" w:cs="Times New Roman"/>
+                <w:kern w:val="0"/>
+                <w:sz w:val="24"/>
+                <w:szCs w:val="24"/>
+                <w:lang w:val="en-US" w:eastAsia="zh-CN" w:bidi="ar"/>
+              </w:rPr>
+              <w:t>Ngày 7</w:t>
+            </w:r>
+          </w:p>
+        </w:tc>
+        <w:tc>
+          <w:tcPr>
+            <w:tcW w:w="1159" w:type="dxa"/>
+            <w:shd w:val="clear"/>
+            <w:vAlign w:val="center"/>
+          </w:tcPr>
+          <w:p>
+            <w:pPr>
+              <w:keepNext w:val="0"/>
+              <w:keepLines w:val="0"/>
+              <w:widowControl/>
+              <w:suppressLineNumbers w:val="0"/>
+              <w:jc w:val="left"/>
+              <w:rPr>
+                <w:rFonts w:hint="default" w:ascii="Times New Roman" w:hAnsi="Times New Roman" w:cs="Times New Roman"/>
+              </w:rPr>
+            </w:pPr>
+            <w:r>
+              <w:rPr>
+                <w:rFonts w:hint="default" w:ascii="Times New Roman" w:hAnsi="Times New Roman" w:eastAsia="宋体" w:cs="Times New Roman"/>
+                <w:kern w:val="0"/>
+                <w:sz w:val="24"/>
+                <w:szCs w:val="24"/>
+                <w:lang w:val="en-US" w:eastAsia="zh-CN" w:bidi="ar"/>
+              </w:rPr>
+              <w:t>11/06/2026</w:t>
+            </w:r>
+          </w:p>
+        </w:tc>
+        <w:tc>
+          <w:tcPr>
+            <w:tcW w:w="2347" w:type="dxa"/>
+            <w:shd w:val="clear"/>
+            <w:vAlign w:val="center"/>
+          </w:tcPr>
+          <w:p>
+            <w:pPr>
+              <w:keepNext w:val="0"/>
+              <w:keepLines w:val="0"/>
+              <w:widowControl/>
+              <w:suppressLineNumbers w:val="0"/>
+              <w:jc w:val="left"/>
+              <w:rPr>
+                <w:rFonts w:hint="default" w:ascii="Times New Roman" w:hAnsi="Times New Roman" w:cs="Times New Roman"/>
+              </w:rPr>
+            </w:pPr>
+            <w:r>
+              <w:rPr>
+                <w:rFonts w:hint="default" w:ascii="Times New Roman" w:hAnsi="Times New Roman" w:eastAsia="宋体" w:cs="Times New Roman"/>
+                <w:kern w:val="0"/>
+                <w:sz w:val="24"/>
+                <w:szCs w:val="24"/>
+                <w:lang w:val="en-US" w:eastAsia="zh-CN" w:bidi="ar"/>
+              </w:rPr>
+              <w:t>Hoàn thiện ERD tổng thể, review logic, fix relations. schema.sql bỏ qua (redundant với TypeORM migration)</w:t>
+            </w:r>
+          </w:p>
+        </w:tc>
+        <w:tc>
+          <w:tcPr>
+            <w:tcW w:w="2910" w:type="dxa"/>
+            <w:shd w:val="clear"/>
+            <w:vAlign w:val="center"/>
+          </w:tcPr>
+          <w:p>
+            <w:pPr>
+              <w:keepNext w:val="0"/>
+              <w:keepLines w:val="0"/>
+              <w:widowControl/>
+              <w:suppressLineNumbers w:val="0"/>
+              <w:jc w:val="left"/>
+              <w:rPr>
+                <w:rFonts w:hint="default" w:ascii="Times New Roman" w:hAnsi="Times New Roman" w:cs="Times New Roman"/>
+              </w:rPr>
+            </w:pPr>
+            <w:r>
+              <w:rPr>
+                <w:rFonts w:hint="default" w:ascii="Times New Roman" w:hAnsi="Times New Roman" w:eastAsia="宋体" w:cs="Times New Roman"/>
+                <w:kern w:val="0"/>
+                <w:sz w:val="24"/>
+                <w:szCs w:val="24"/>
+                <w:lang w:val="en-US" w:eastAsia="zh-CN" w:bidi="ar"/>
+              </w:rPr>
+              <w:t>ERD_HospitalCare_final.txt</w:t>
+            </w:r>
+          </w:p>
+        </w:tc>
+        <w:tc>
+          <w:tcPr>
+            <w:tcW w:w="915" w:type="dxa"/>
+            <w:shd w:val="clear"/>
+            <w:vAlign w:val="center"/>
+          </w:tcPr>
+          <w:p>
+            <w:pPr>
+              <w:keepNext w:val="0"/>
+              <w:keepLines w:val="0"/>
+              <w:widowControl/>
+              <w:suppressLineNumbers w:val="0"/>
+              <w:jc w:val="left"/>
+              <w:rPr>
+                <w:rFonts w:hint="default" w:ascii="Times New Roman" w:hAnsi="Times New Roman" w:cs="Times New Roman"/>
+              </w:rPr>
+            </w:pPr>
+            <w:r>
+              <w:rPr>
+                <w:rFonts w:hint="default" w:ascii="Times New Roman" w:hAnsi="Times New Roman" w:eastAsia="宋体" w:cs="Times New Roman"/>
+                <w:kern w:val="0"/>
+                <w:sz w:val="24"/>
+                <w:szCs w:val="24"/>
+                <w:lang w:val="en-US" w:eastAsia="zh-CN" w:bidi="ar"/>
+              </w:rPr>
+              <w:t>Hoàn thành</w:t>
             </w:r>
           </w:p>
         </w:tc>

</xml_diff>